<commit_message>
EO signs the enquiry report. Documents, not names.
</commit_message>
<xml_diff>
--- a/1_Notesheet_Bagchi.docx
+++ b/1_Notesheet_Bagchi.docx
@@ -115,7 +115,7 @@
           <w:color w:val="000000"/>
           <w:sz w:val="24"/>
         </w:rPr>
-        <w:t>It is submitted that Smt. Panchali Bagchi, wife of Late Debabrata Bagchi, of Naibedya, Tritirtha Lane, Chakbhabani, Balurghat, appeared in this office on 28.09.2026 and applied for a Legal Heirship Certificate of her husband. Late Debabrata Bagchi, son of Late Bhupendra Nath Bagchi, died on 02.04.2017. She states that he left no Will, and that the heirs are herself and two sons, Diptobrata Bagchi and Saumyabrata Bagchi. Any name or address which differs from paper to paper shall be taken from the death certificate and the original Aadhaar card.</w:t>
+        <w:t>It is submitted that an application has been received in this office for a Legal Heirship Certificate of Late Debabrata Bagchi, who died on 02.04.2017. The certificate is required for transmission of 400 shares of Tata Elxsi Ltd., Folio No. EXD0001178. The applicant states that there is no Will. The names of the heirs are not being taken from the application. They are to be taken from the documents.</w:t>
       </w:r>
     </w:p>
     <w:p>
@@ -131,7 +131,7 @@
           <w:color w:val="000000"/>
           <w:sz w:val="24"/>
         </w:rPr>
-        <w:t>He held 400 shares of Tata Elxsi Ltd., Folio No. EXD0001178, Certificate No. B247787. MUFG Intime India Pvt. Ltd., by letter dated 20.07.2026, has returned the papers. A certificate of the Municipality will not be accepted. The Registrar requires a certificate of a Tehsildar, or of an authority above that rank, on official letterhead, with seal and signature. This office is above that rank and will issue the certificate after enquiry. The old municipal certificate is not relied upon.</w:t>
+        <w:t>The Registrar has not accepted a certificate of the Municipality. Under SEBI Circular dated 23.07.2026, clause 2.1(c) and clause 4.2.2.3, the Legal Heirship Certificate must be of a revenue authority not below the rank of a Tehsildar. This office will issue that certificate after enquiry. The indemnity bond and the affidavit of the heirs are for the applicant to file with the Registrar. If there is a dispute, no certificate will be issued. The old municipal certificate is not relied upon.</w:t>
       </w:r>
     </w:p>
     <w:p>
@@ -147,7 +147,7 @@
           <w:color w:val="000000"/>
           <w:sz w:val="24"/>
         </w:rPr>
-        <w:t>Under the Hindu Succession Act, 1956, the Class I heirs are the widow, the sons, the daughters and the mother, and also the children of a son or daughter who died earlier and the widow of such a son. If only the widow and two sons are living, each takes one-third. A living mother, or a daughter, changes the shares. The file is silent on the mother and on any daughter. If a dispute is found, no certificate will be issued.</w:t>
+        <w:t>Under the Hindu Succession Act, 1956, the Class I heirs are the widow, the sons, the daughters and the mother, and also the children of a son or daughter who died earlier and the widow of such a son. A person left out, or a name which does not tally with the documents, will not do.</w:t>
       </w:r>
     </w:p>
     <w:p>
@@ -163,12 +163,12 @@
           <w:color w:val="000000"/>
           <w:sz w:val="24"/>
         </w:rPr>
-        <w:t>As the deceased last resided in Balurghat Municipality, the Executive Officer may be requested to cause a field enquiry and to return the enclosed proforma within 7 (seven) days. The Municipality will not issue a certificate of its own. On a complete report, the Legal Heirship Certificate will be put up on the letterhead of this office.</w:t>
+        <w:t>As the deceased last resided in Balurghat Municipality, the Executive Officer, Balurghat Municipality, may be requested to cause a field enquiry and to sign the enclosed report and forward it to this office within 7 (seven) days. The enquiry officer shall see both documents of each heir. The name in the report must tally with the name in the documents. The Municipality will not issue a certificate of its own.</w:t>
       </w:r>
     </w:p>
     <w:p>
       <w:pPr>
-        <w:spacing w:before="0" w:after="200" w:lineRule="exact" w:line="320"/>
+        <w:spacing w:before="0" w:after="200" w:lineRule="exact" w:line="300"/>
         <w:jc w:val="both"/>
       </w:pPr>
       <w:r>

</xml_diff>

<commit_message>
Cite SEBI circular and bar the municipal certificate.
</commit_message>
<xml_diff>
--- a/1_Notesheet_Bagchi.docx
+++ b/1_Notesheet_Bagchi.docx
@@ -115,7 +115,7 @@
           <w:color w:val="000000"/>
           <w:sz w:val="24"/>
         </w:rPr>
-        <w:t>It is submitted that an application has been received in this office for a Legal Heirship Certificate of Late Debabrata Bagchi, who died on 02.04.2017. The certificate is required for transmission of 400 shares of Tata Elxsi Ltd., Folio No. EXD0001178. The applicant states that there is no Will. The names of the heirs are not being taken from the application. They are to be taken from the documents.</w:t>
+        <w:t>It is submitted that an application dated 28.09.2026 has been received for a Legal Heirship Certificate of Late Debabrata Bagchi, son of Late Bhupendra Nath Bagchi, who died on 02.04.2017. The certificate is required for transmission of 400 shares of Tata Elxsi Ltd., Folio No. EXD0001178, Certificate No. B247787. The applicant states that the deceased left no Will.</w:t>
       </w:r>
     </w:p>
     <w:p>
@@ -131,7 +131,7 @@
           <w:color w:val="000000"/>
           <w:sz w:val="24"/>
         </w:rPr>
-        <w:t>The Registrar has not accepted a certificate of the Municipality. Under SEBI Circular dated 23.07.2026, clause 2.1(c) and clause 4.2.2.3, the Legal Heirship Certificate must be of a revenue authority not below the rank of a Tehsildar. This office will issue that certificate after enquiry. The indemnity bond and the affidavit of the heirs are for the applicant to file with the Registrar. If there is a dispute, no certificate will be issued. The old municipal certificate is not relied upon.</w:t>
+        <w:t>MUFG Intime India Private Limited, by letter dated 20.07.2026 (Reference No. ID80033739, Outward No. OD80033136), has refused the Legal Heir Certificate earlier issued by Balurghat Municipality. That certificate is not to be acted upon. The Registrar requires a certificate of the Tehsildar, or of an authority above that rank, on the official letterhead, signed with the name of the authority, bearing the government seal and stamp, valid for transmission of the shares, and issued in favour of the surviving legal heirs. SEBI Circular No. HO/38/13/11(14)2026-MIRSD-POD/I/17111/2026 dated 23.07.2026, clause 2.1(c) read with clause 4.2.2.3, provides that the relevant authority is a revenue authority not below the rank of a Tehsildar. This office will issue the certificate after enquiry. If a dispute is found, no certificate will be issued.</w:t>
       </w:r>
     </w:p>
     <w:p>
@@ -147,7 +147,7 @@
           <w:color w:val="000000"/>
           <w:sz w:val="24"/>
         </w:rPr>
-        <w:t>Under the Hindu Succession Act, 1956, the Class I heirs are the widow, the sons, the daughters and the mother, and also the children of a son or daughter who died earlier and the widow of such a son. A person left out, or a name which does not tally with the documents, will not do.</w:t>
+        <w:t>Under the Hindu Succession Act, 1956, the Class I heirs are the widow, the sons, the daughters and the mother, and the children of a son or daughter who died earlier and the widow of such a son. The name of each heir shall be taken from the documents and shall tally with those documents.</w:t>
       </w:r>
     </w:p>
     <w:p>
@@ -163,7 +163,7 @@
           <w:color w:val="000000"/>
           <w:sz w:val="24"/>
         </w:rPr>
-        <w:t>As the deceased last resided in Balurghat Municipality, the Executive Officer, Balurghat Municipality, may be requested to cause a field enquiry and to sign the enclosed report and forward it to this office within 7 (seven) days. The enquiry officer shall see both documents of each heir. The name in the report must tally with the name in the documents. The Municipality will not issue a certificate of its own.</w:t>
+        <w:t>The deceased last resided within Balurghat Municipality. The Executive Officer, Balurghat Municipality, may be requested to cause a fresh field enquiry, to sign the enclosed report, and to forward it to this office within 7 (seven) days. The enquiry shall not proceed on the municipal certificate. The Municipality shall not issue a Legal Heir Certificate in this case.</w:t>
       </w:r>
     </w:p>
     <w:p>

</xml_diff>

<commit_message>
Certificate draft and SEBI annexure fields.
</commit_message>
<xml_diff>
--- a/1_Notesheet_Bagchi.docx
+++ b/1_Notesheet_Bagchi.docx
@@ -4,7 +4,7 @@
   <w:body>
     <w:p>
       <w:pPr>
-        <w:spacing w:before="0" w:after="0" w:lineRule="exact" w:line="360"/>
+        <w:spacing w:before="0" w:after="0" w:lineRule="exact" w:line="340"/>
         <w:jc w:val="center"/>
       </w:pPr>
       <w:r>
@@ -20,7 +20,7 @@
     </w:p>
     <w:p>
       <w:pPr>
-        <w:spacing w:before="0" w:after="40" w:lineRule="exact" w:line="360"/>
+        <w:spacing w:before="0" w:after="20" w:lineRule="exact" w:line="320"/>
         <w:jc w:val="center"/>
       </w:pPr>
       <w:r>
@@ -29,14 +29,14 @@
           <w:b/>
           <w:i w:val="0"/>
           <w:color w:val="000000"/>
-          <w:sz w:val="28"/>
+          <w:sz w:val="26"/>
         </w:rPr>
         <w:t>BALURGHAT, DAKSHIN DINAJPUR</w:t>
       </w:r>
     </w:p>
     <w:p>
       <w:pPr>
-        <w:spacing w:before="40" w:after="120" w:lineRule="exact" w:line="520"/>
+        <w:spacing w:before="40" w:after="80" w:lineRule="exact" w:line="480"/>
         <w:jc w:val="center"/>
       </w:pPr>
       <w:r>
@@ -45,14 +45,14 @@
           <w:b/>
           <w:i w:val="0"/>
           <w:color w:val="000000"/>
-          <w:sz w:val="44"/>
+          <w:sz w:val="40"/>
         </w:rPr>
         <w:t>NOTE SHEET</w:t>
       </w:r>
     </w:p>
     <w:p>
       <w:pPr>
-        <w:spacing w:before="0" w:after="0" w:lineRule="exact" w:line="320"/>
+        <w:spacing w:before="0" w:after="0" w:lineRule="exact" w:line="300"/>
         <w:jc w:val="left"/>
       </w:pPr>
       <w:r>
@@ -63,22 +63,12 @@
           <w:color w:val="000000"/>
           <w:sz w:val="24"/>
         </w:rPr>
-        <w:t xml:space="preserve">Deptt./Sec.  </w:t>
-      </w:r>
-      <w:r>
-        <w:rPr>
-          <w:rFonts w:ascii="Bookman Old Style" w:hAnsi="Bookman Old Style" w:cs="Bookman Old Style" w:eastAsia="Bookman Old Style"/>
-          <w:b/>
-          <w:i w:val="0"/>
-          <w:color w:val="000000"/>
-          <w:sz w:val="24"/>
-        </w:rPr>
-        <w:t>SDO Balurghat (S)</w:t>
+        <w:t>Deptt./Sec.  SDO Balurghat (S)</w:t>
       </w:r>
     </w:p>
     <w:p>
       <w:pPr>
-        <w:spacing w:before="40" w:after="160" w:lineRule="exact" w:line="320"/>
+        <w:spacing w:before="40" w:after="120" w:lineRule="exact" w:line="300"/>
         <w:jc w:val="left"/>
       </w:pPr>
       <w:r>
@@ -89,7 +79,7 @@
           <w:color w:val="000000"/>
           <w:sz w:val="24"/>
         </w:rPr>
-        <w:t>Date.  ______________</w:t>
+        <w:t>Date. ______________</w:t>
       </w:r>
       <w:r>
         <w:rPr>
@@ -99,12 +89,12 @@
           <w:color w:val="000000"/>
           <w:sz w:val="24"/>
         </w:rPr>
-        <w:t xml:space="preserve">                    Collection No.  ...........................</w:t>
+        <w:t xml:space="preserve">          Collection No. ...........................</w:t>
       </w:r>
     </w:p>
     <w:p>
       <w:pPr>
-        <w:spacing w:before="0" w:after="120" w:lineRule="exact" w:line="300"/>
+        <w:spacing w:before="0" w:after="100" w:lineRule="exact" w:line="300"/>
         <w:jc w:val="both"/>
       </w:pPr>
       <w:r>
@@ -115,12 +105,12 @@
           <w:color w:val="000000"/>
           <w:sz w:val="24"/>
         </w:rPr>
-        <w:t>It is submitted that an application dated 28.09.2026 has been received for a Legal Heirship Certificate of Late Debabrata Bagchi, son of Late Bhupendra Nath Bagchi, who died on 02.04.2017. The certificate is required for transmission of 400 shares of Tata Elxsi Ltd., Folio No. EXD0001178, Certificate No. B247787. The applicant states that the deceased left no Will.</w:t>
+        <w:t>It is submitted that Smt. Panchali Bagchi, wife of Late Debabrata Bagchi, of Nibedya, Tritirtha Lane, Chakbhabani, Balurghat, has applied on 28.09.2026 for a Legal Heirship Certificate of her husband, who died on 02.04.2017. The certificate is required for transmission of 400 shares of Tata Elxsi Ltd., Folio No. EXD0001178, Certificate No. B247787.</w:t>
       </w:r>
     </w:p>
     <w:p>
       <w:pPr>
-        <w:spacing w:before="0" w:after="120" w:lineRule="exact" w:line="300"/>
+        <w:spacing w:before="0" w:after="100" w:lineRule="exact" w:line="300"/>
         <w:jc w:val="both"/>
       </w:pPr>
       <w:r>
@@ -131,12 +121,12 @@
           <w:color w:val="000000"/>
           <w:sz w:val="24"/>
         </w:rPr>
-        <w:t>MUFG Intime India Private Limited, by letter dated 20.07.2026 (Reference No. ID80033739, Outward No. OD80033136), has refused the Legal Heir Certificate earlier issued by Balurghat Municipality. That certificate is not to be acted upon. The Registrar requires a certificate of the Tehsildar, or of an authority above that rank, on the official letterhead, signed with the name of the authority, bearing the government seal and stamp, valid for transmission of the shares, and issued in favour of the surviving legal heirs. SEBI Circular No. HO/38/13/11(14)2026-MIRSD-POD/I/17111/2026 dated 23.07.2026, clause 2.1(c) read with clause 4.2.2.3, provides that the relevant authority is a revenue authority not below the rank of a Tehsildar. This office will issue the certificate after enquiry. If a dispute is found, no certificate will be issued.</w:t>
+        <w:t>MUFG Intime India Private Limited, by letter dated 20.07.2026 (Reference No. ID80033739, Outward No. OD80033136), has refused the Legal Heir Certificate earlier issued by Balurghat Municipality. That certificate is not allowed. The Registrar requires a certificate of the Tehsildar, or of an authority above that rank, on the official letterhead, signed with the name of the authority, with the government seal and stamp, valid for transmission of the shares, and issued in favour of the surviving legal heirs. SEBI Circular No. HO/38/13/11(14)2026-MIRSD-POD/I/17111/2026 dated 23.07.2026, clause 2.1(c) read with clause 4.2.2.3, is to the same effect. The value of the shares is stated to exceed the threshold. This office will issue the certificate only after the enquiry report is received, and only in the form the Registrar has asked for.</w:t>
       </w:r>
     </w:p>
     <w:p>
       <w:pPr>
-        <w:spacing w:before="0" w:after="120" w:lineRule="exact" w:line="300"/>
+        <w:spacing w:before="0" w:after="100" w:lineRule="exact" w:line="300"/>
         <w:jc w:val="both"/>
       </w:pPr>
       <w:r>
@@ -147,7 +137,7 @@
           <w:color w:val="000000"/>
           <w:sz w:val="24"/>
         </w:rPr>
-        <w:t>Under the Hindu Succession Act, 1956, the Class I heirs are the widow, the sons, the daughters and the mother, and the children of a son or daughter who died earlier and the widow of such a son. The name of each heir shall be taken from the documents and shall tally with those documents.</w:t>
+        <w:t>The certificate will not by itself complete the transmission. Under the same circular the applicant must also file with the Registrar a notarised indemnity bond in Annexure-4 and a notarised affidavit-cum-NOC of all legal heirs in Annexure-5, on non-judicial stamp paper. The Registrar has also asked for a self-attested PAN of the legal heir and for the distinctive numbers 17219031-17219130 to be correctly stated. Those papers are for the applicant. They are not to be issued by this office.</w:t>
       </w:r>
     </w:p>
     <w:p>
@@ -163,23 +153,7 @@
           <w:color w:val="000000"/>
           <w:sz w:val="24"/>
         </w:rPr>
-        <w:t>The deceased last resided within Balurghat Municipality. The Executive Officer, Balurghat Municipality, may be requested to cause a fresh field enquiry, to sign the enclosed report, and to forward it to this office within 7 (seven) days. The enquiry shall not proceed on the municipal certificate. The Municipality shall not issue a Legal Heir Certificate in this case.</w:t>
-      </w:r>
-    </w:p>
-    <w:p>
-      <w:pPr>
-        <w:spacing w:before="0" w:after="200" w:lineRule="exact" w:line="300"/>
-        <w:jc w:val="both"/>
-      </w:pPr>
-      <w:r>
-        <w:rPr>
-          <w:rFonts w:ascii="Bookman Old Style" w:hAnsi="Bookman Old Style" w:cs="Bookman Old Style" w:eastAsia="Bookman Old Style"/>
-          <w:b w:val="0"/>
-          <w:i w:val="0"/>
-          <w:color w:val="000000"/>
-          <w:sz w:val="24"/>
-        </w:rPr>
-        <w:t>A memo to this effect is placed below.</w:t>
+        <w:t>The deceased last resided in Balurghat Municipality. The Executive Officer may be requested to cause a field enquiry, to sign the enclosed report, and to forward it within 15 (fifteen) days. The name in the report must tally with the documents. The municipal certificate shall not be used. On a complete report, with no Will and no dispute, the draft certificate placed below may be filled and issued.</w:t>
       </w:r>
     </w:p>
     <w:p>
@@ -200,7 +174,7 @@
     </w:p>
     <w:sectPr>
       <w:pgSz w:w="12240" w:h="15840"/>
-      <w:pgMar w:top="1000" w:right="1440" w:bottom="900" w:left="1440" w:header="500" w:footer="400" w:gutter="0"/>
+      <w:pgMar w:top="860" w:right="1080" w:bottom="720" w:left="1080" w:header="720" w:footer="720" w:gutter="0"/>
       <w:cols w:space="720"/>
       <w:docGrid w:linePitch="360"/>
     </w:sectPr>
@@ -571,9 +545,6 @@
     <w:name w:val="Normal"/>
     <w:qFormat/>
     <w:rsid w:val="00FC693F"/>
-    <w:pPr>
-      <w:spacing w:before="0" w:after="0"/>
-    </w:pPr>
     <w:rPr>
       <w:rFonts w:ascii="Bookman Old Style" w:hAnsi="Bookman Old Style" w:cs="Bookman Old Style" w:eastAsia="Bookman Old Style"/>
       <w:color w:val="000000"/>

</xml_diff>

<commit_message>
Clean certificate. Aadhaar, Voter and PAN blanks.
</commit_message>
<xml_diff>
--- a/1_Notesheet_Bagchi.docx
+++ b/1_Notesheet_Bagchi.docx
@@ -121,7 +121,7 @@
           <w:color w:val="000000"/>
           <w:sz w:val="24"/>
         </w:rPr>
-        <w:t>MUFG Intime India Private Limited, by letter dated 20.07.2026 (Reference No. ID80033739, Outward No. OD80033136), has refused the Legal Heir Certificate earlier issued by Balurghat Municipality. That certificate is not allowed. The Registrar requires a certificate of the Tehsildar, or of an authority above that rank, on the official letterhead, signed with the name of the authority, with the government seal and stamp, valid for transmission of the shares, and issued in favour of the surviving legal heirs. SEBI Circular No. HO/38/13/11(14)2026-MIRSD-POD/I/17111/2026 dated 23.07.2026, clause 2.1(c) read with clause 4.2.2.3, is to the same effect. The value of the shares is stated to exceed the threshold. This office will issue the certificate only after the enquiry report is received, and only in the form the Registrar has asked for.</w:t>
+        <w:t>MUFG Intime India Private Limited, by letter dated 20.07.2026 (Reference No. ID80033739, Outward No. OD80033136), has refused the Legal Heir Certificate earlier issued by Balurghat Municipality. That certificate is not allowed. The certificate now required must be of the Tehsildar, or of an authority above that rank, on the official letterhead, signed with the name of the authority, with the government seal and stamp, valid for transmission of the shares, and in favour of the surviving legal heirs. SEBI Circular No. HO/38/13/11(14)2026-MIRSD-POD/I/17111/2026 dated 23.07.2026, clause 2.1(c) read with clause 4.2.2.3, is to the same effect. The draft certificate placed below is in that form. It is not to be issued until the enquiry report is received. No note to the applicant is to be printed on the certificate.</w:t>
       </w:r>
     </w:p>
     <w:p>
@@ -137,7 +137,7 @@
           <w:color w:val="000000"/>
           <w:sz w:val="24"/>
         </w:rPr>
-        <w:t>The certificate will not by itself complete the transmission. Under the same circular the applicant must also file with the Registrar a notarised indemnity bond in Annexure-4 and a notarised affidavit-cum-NOC of all legal heirs in Annexure-5, on non-judicial stamp paper. The Registrar has also asked for a self-attested PAN of the legal heir and for the distinctive numbers 17219031-17219130 to be correctly stated. Those papers are for the applicant. They are not to be issued by this office.</w:t>
+        <w:t>The certificate will not by itself complete the transmission. The applicant must separately file with the Registrar a notarised indemnity bond in Annexure-4 of the circular and a notarised affidavit-cum-NOC of all legal heirs in Annexure-5, on non-judicial stamp paper. The Registrar has also asked for a self-attested PAN of the legal heir, and for distinctive numbers 17219031-17219130 to be correctly stated on the affidavit. A copy of the certificate, if submitted, is to be attested by a Notary Public as a true copy, with the complete address of the Notary. Those papers are for the applicant. They are not part of the certificate.</w:t>
       </w:r>
     </w:p>
     <w:p>
@@ -153,7 +153,7 @@
           <w:color w:val="000000"/>
           <w:sz w:val="24"/>
         </w:rPr>
-        <w:t>The deceased last resided in Balurghat Municipality. The Executive Officer may be requested to cause a field enquiry, to sign the enclosed report, and to forward it within 15 (fifteen) days. The name in the report must tally with the documents. The municipal certificate shall not be used. On a complete report, with no Will and no dispute, the draft certificate placed below may be filled and issued.</w:t>
+        <w:t>The deceased last resided in Balurghat Municipality. The Executive Officer may be requested to cause a field enquiry, to fill Aadhaar number, Voter Identity Card number and PAN of each heir, to sign the report, and to forward it within 15 (fifteen) days. The name in the report must tally with the documents. The municipal certificate shall not be used.</w:t>
       </w:r>
     </w:p>
     <w:p>
@@ -174,7 +174,7 @@
     </w:p>
     <w:sectPr>
       <w:pgSz w:w="12240" w:h="15840"/>
-      <w:pgMar w:top="860" w:right="1080" w:bottom="720" w:left="1080" w:header="720" w:footer="720" w:gutter="0"/>
+      <w:pgMar w:top="860" w:right="1080" w:bottom="700" w:left="1080" w:header="720" w:footer="720" w:gutter="0"/>
       <w:cols w:space="720"/>
       <w:docGrid w:linePitch="360"/>
     </w:sectPr>

</xml_diff>

<commit_message>
Correct grammar and cut repeated wording.
</commit_message>
<xml_diff>
--- a/1_Notesheet_Bagchi.docx
+++ b/1_Notesheet_Bagchi.docx
@@ -1,18 +1,88 @@
 
 <file path=word/document.xml><?xml version="1.0" encoding="utf-8"?>
-<w:document xmlns:wpc="http://schemas.microsoft.com/office/word/2010/wordprocessingCanvas" xmlns:mo="http://schemas.microsoft.com/office/mac/office/2008/main" xmlns:mc="http://schemas.openxmlformats.org/markup-compatibility/2006" xmlns:mv="urn:schemas-microsoft-com:mac:vml" xmlns:o="urn:schemas-microsoft-com:office:office" xmlns:r="http://schemas.openxmlformats.org/officeDocument/2006/relationships" xmlns:m="http://schemas.openxmlformats.org/officeDocument/2006/math" xmlns:v="urn:schemas-microsoft-com:vml" xmlns:wp14="http://schemas.microsoft.com/office/word/2010/wordprocessingDrawing" xmlns:wp="http://schemas.openxmlformats.org/drawingml/2006/wordprocessingDrawing" xmlns:w10="urn:schemas-microsoft-com:office:word" xmlns:w="http://schemas.openxmlformats.org/wordprocessingml/2006/main" xmlns:w14="http://schemas.microsoft.com/office/word/2010/wordml" xmlns:wpg="http://schemas.microsoft.com/office/word/2010/wordprocessingGroup" xmlns:wpi="http://schemas.microsoft.com/office/word/2010/wordprocessingInk" xmlns:wne="http://schemas.microsoft.com/office/word/2006/wordml" xmlns:wps="http://schemas.microsoft.com/office/word/2010/wordprocessingShape" mc:Ignorable="w14 wp14">
+<w:document xmlns:wpc="http://schemas.microsoft.com/office/word/2010/wordprocessingCanvas" xmlns:mc="http://schemas.openxmlformats.org/markup-compatibility/2006" xmlns:o="urn:schemas-microsoft-com:office:office" xmlns:r="http://schemas.openxmlformats.org/officeDocument/2006/relationships" xmlns:m="http://schemas.openxmlformats.org/officeDocument/2006/math" xmlns:v="urn:schemas-microsoft-com:vml" xmlns:wp14="http://schemas.microsoft.com/office/word/2010/wordprocessingDrawing" xmlns:wp="http://schemas.openxmlformats.org/drawingml/2006/wordprocessingDrawing" xmlns:w10="urn:schemas-microsoft-com:office:word" xmlns:w="http://schemas.openxmlformats.org/wordprocessingml/2006/main" xmlns:w14="http://schemas.microsoft.com/office/word/2010/wordml" xmlns:wpg="http://schemas.microsoft.com/office/word/2010/wordprocessingGroup" xmlns:wpi="http://schemas.microsoft.com/office/word/2010/wordprocessingInk" xmlns:wne="http://schemas.microsoft.com/office/word/2006/wordml" xmlns:wps="http://schemas.microsoft.com/office/word/2010/wordprocessingShape" mc:Ignorable="w14 wp14">
   <w:body>
     <w:p>
       <w:pPr>
-        <w:spacing w:before="0" w:after="0" w:lineRule="exact" w:line="340"/>
+        <w:spacing w:after="0" w:line="340" w:lineRule="exact"/>
         <w:jc w:val="center"/>
       </w:pPr>
       <w:r>
         <w:rPr>
-          <w:rFonts w:ascii="Bookman Old Style" w:hAnsi="Bookman Old Style" w:cs="Bookman Old Style" w:eastAsia="Bookman Old Style"/>
           <w:b/>
-          <w:i w:val="0"/>
-          <w:color w:val="000000"/>
+          <w:noProof/>
+          <w:sz w:val="40"/>
+          <w:lang w:val="en-IN" w:eastAsia="en-IN"/>
+        </w:rPr>
+        <mc:AlternateContent>
+          <mc:Choice Requires="wps">
+            <w:drawing>
+              <wp:anchor distT="0" distB="0" distL="114300" distR="114300" simplePos="0" relativeHeight="251660288" behindDoc="0" locked="0" layoutInCell="1" allowOverlap="1" wp14:anchorId="79D15B7C" wp14:editId="6FAFA1EC">
+                <wp:simplePos x="0" y="0"/>
+                <wp:positionH relativeFrom="column">
+                  <wp:posOffset>-114300</wp:posOffset>
+                </wp:positionH>
+                <wp:positionV relativeFrom="paragraph">
+                  <wp:posOffset>-488950</wp:posOffset>
+                </wp:positionV>
+                <wp:extent cx="0" cy="9877425"/>
+                <wp:effectExtent l="57150" t="19050" r="76200" b="85725"/>
+                <wp:wrapNone/>
+                <wp:docPr id="3" name="Straight Connector 3"/>
+                <wp:cNvGraphicFramePr/>
+                <a:graphic xmlns:a="http://schemas.openxmlformats.org/drawingml/2006/main">
+                  <a:graphicData uri="http://schemas.microsoft.com/office/word/2010/wordprocessingShape">
+                    <wps:wsp>
+                      <wps:cNvCnPr/>
+                      <wps:spPr>
+                        <a:xfrm>
+                          <a:off x="0" y="0"/>
+                          <a:ext cx="0" cy="9877425"/>
+                        </a:xfrm>
+                        <a:prstGeom prst="line">
+                          <a:avLst/>
+                        </a:prstGeom>
+                        <a:ln w="3175"/>
+                      </wps:spPr>
+                      <wps:style>
+                        <a:lnRef idx="2">
+                          <a:schemeClr val="dk1"/>
+                        </a:lnRef>
+                        <a:fillRef idx="0">
+                          <a:schemeClr val="dk1"/>
+                        </a:fillRef>
+                        <a:effectRef idx="1">
+                          <a:schemeClr val="dk1"/>
+                        </a:effectRef>
+                        <a:fontRef idx="minor">
+                          <a:schemeClr val="tx1"/>
+                        </a:fontRef>
+                      </wps:style>
+                      <wps:bodyPr/>
+                    </wps:wsp>
+                  </a:graphicData>
+                </a:graphic>
+                <wp14:sizeRelH relativeFrom="margin">
+                  <wp14:pctWidth>0</wp14:pctWidth>
+                </wp14:sizeRelH>
+                <wp14:sizeRelV relativeFrom="margin">
+                  <wp14:pctHeight>0</wp14:pctHeight>
+                </wp14:sizeRelV>
+              </wp:anchor>
+            </w:drawing>
+          </mc:Choice>
+          <mc:Fallback>
+            <w:pict>
+              <v:line id="Straight Connector 3" o:spid="_x0000_s1026" style="position:absolute;z-index:251660288;visibility:visible;mso-wrap-style:square;mso-width-percent:0;mso-height-percent:0;mso-wrap-distance-left:9pt;mso-wrap-distance-top:0;mso-wrap-distance-right:9pt;mso-wrap-distance-bottom:0;mso-position-horizontal:absolute;mso-position-horizontal-relative:text;mso-position-vertical:absolute;mso-position-vertical-relative:text;mso-width-percent:0;mso-height-percent:0;mso-width-relative:margin;mso-height-relative:margin" from="-9pt,-38.5pt" to="-9pt,739.25pt" o:gfxdata="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" strokecolor="black [3200]" strokeweight=".25pt">
+                <v:shadow on="t" color="black" opacity="24903f" origin=",.5" offset="0,.55556mm"/>
+              </v:line>
+            </w:pict>
+          </mc:Fallback>
+        </mc:AlternateContent>
+      </w:r>
+      <w:r>
+        <w:rPr>
+          <w:b/>
           <w:sz w:val="28"/>
         </w:rPr>
         <w:t>OFFICE OF THE SUB-DIVISIONAL OFFICER</w:t>
@@ -20,15 +90,12 @@
     </w:p>
     <w:p>
       <w:pPr>
-        <w:spacing w:before="0" w:after="20" w:lineRule="exact" w:line="320"/>
+        <w:spacing w:after="20" w:line="320" w:lineRule="exact"/>
         <w:jc w:val="center"/>
       </w:pPr>
       <w:r>
         <w:rPr>
-          <w:rFonts w:ascii="Bookman Old Style" w:hAnsi="Bookman Old Style" w:cs="Bookman Old Style" w:eastAsia="Bookman Old Style"/>
           <w:b/>
-          <w:i w:val="0"/>
-          <w:color w:val="000000"/>
           <w:sz w:val="26"/>
         </w:rPr>
         <w:t>BALURGHAT, DAKSHIN DINAJPUR</w:t>
@@ -36,15 +103,12 @@
     </w:p>
     <w:p>
       <w:pPr>
-        <w:spacing w:before="40" w:after="80" w:lineRule="exact" w:line="480"/>
+        <w:spacing w:before="40" w:after="80" w:line="480" w:lineRule="exact"/>
         <w:jc w:val="center"/>
       </w:pPr>
       <w:r>
         <w:rPr>
-          <w:rFonts w:ascii="Bookman Old Style" w:hAnsi="Bookman Old Style" w:cs="Bookman Old Style" w:eastAsia="Bookman Old Style"/>
           <w:b/>
-          <w:i w:val="0"/>
-          <w:color w:val="000000"/>
           <w:sz w:val="40"/>
         </w:rPr>
         <w:t>NOTE SHEET</w:t>
@@ -52,125 +116,218 @@
     </w:p>
     <w:p>
       <w:pPr>
-        <w:spacing w:before="0" w:after="0" w:lineRule="exact" w:line="300"/>
-        <w:jc w:val="left"/>
+        <w:spacing w:after="0" w:line="300" w:lineRule="exact"/>
       </w:pPr>
       <w:r>
         <w:rPr>
-          <w:rFonts w:ascii="Bookman Old Style" w:hAnsi="Bookman Old Style" w:cs="Bookman Old Style" w:eastAsia="Bookman Old Style"/>
           <w:b/>
-          <w:i w:val="0"/>
-          <w:color w:val="000000"/>
-          <w:sz w:val="24"/>
         </w:rPr>
-        <w:t>Deptt./Sec.  SDO Balurghat (S)</w:t>
+        <w:t xml:space="preserve">                                                                   </w:t>
+      </w:r>
+      <w:proofErr w:type="spellStart"/>
+      <w:r>
+        <w:rPr>
+          <w:b/>
+        </w:rPr>
+        <w:t>Deptt</w:t>
+      </w:r>
+      <w:proofErr w:type="spellEnd"/>
+      <w:proofErr w:type="gramStart"/>
+      <w:r>
+        <w:rPr>
+          <w:b/>
+        </w:rPr>
+        <w:t>./</w:t>
+      </w:r>
+      <w:proofErr w:type="gramEnd"/>
+      <w:r>
+        <w:rPr>
+          <w:b/>
+        </w:rPr>
+        <w:t>Sec.  SDO Balurghat (S)</w:t>
       </w:r>
     </w:p>
     <w:p>
       <w:pPr>
-        <w:spacing w:before="40" w:after="120" w:lineRule="exact" w:line="300"/>
-        <w:jc w:val="left"/>
+        <w:spacing w:before="40" w:after="120" w:line="300" w:lineRule="exact"/>
       </w:pPr>
       <w:r>
         <w:rPr>
-          <w:rFonts w:ascii="Bookman Old Style" w:hAnsi="Bookman Old Style" w:cs="Bookman Old Style" w:eastAsia="Bookman Old Style"/>
           <w:b/>
-          <w:i w:val="0"/>
-          <w:color w:val="000000"/>
-          <w:sz w:val="24"/>
+          <w:noProof/>
+          <w:lang w:val="en-IN" w:eastAsia="en-IN"/>
         </w:rPr>
-        <w:t>Date. ______________</w:t>
+        <mc:AlternateContent>
+          <mc:Choice Requires="wps">
+            <w:drawing>
+              <wp:anchor distT="0" distB="0" distL="114300" distR="114300" simplePos="0" relativeHeight="251659264" behindDoc="0" locked="0" layoutInCell="1" allowOverlap="1">
+                <wp:simplePos x="0" y="0"/>
+                <wp:positionH relativeFrom="column">
+                  <wp:posOffset>-114300</wp:posOffset>
+                </wp:positionH>
+                <wp:positionV relativeFrom="paragraph">
+                  <wp:posOffset>225425</wp:posOffset>
+                </wp:positionV>
+                <wp:extent cx="6734175" cy="0"/>
+                <wp:effectExtent l="38100" t="38100" r="66675" b="95250"/>
+                <wp:wrapNone/>
+                <wp:docPr id="1" name="Straight Connector 1"/>
+                <wp:cNvGraphicFramePr/>
+                <a:graphic xmlns:a="http://schemas.openxmlformats.org/drawingml/2006/main">
+                  <a:graphicData uri="http://schemas.microsoft.com/office/word/2010/wordprocessingShape">
+                    <wps:wsp>
+                      <wps:cNvCnPr/>
+                      <wps:spPr>
+                        <a:xfrm>
+                          <a:off x="0" y="0"/>
+                          <a:ext cx="6734175" cy="0"/>
+                        </a:xfrm>
+                        <a:prstGeom prst="line">
+                          <a:avLst/>
+                        </a:prstGeom>
+                        <a:ln w="3175">
+                          <a:solidFill>
+                            <a:schemeClr val="tx1"/>
+                          </a:solidFill>
+                        </a:ln>
+                      </wps:spPr>
+                      <wps:style>
+                        <a:lnRef idx="2">
+                          <a:schemeClr val="dk1"/>
+                        </a:lnRef>
+                        <a:fillRef idx="0">
+                          <a:schemeClr val="dk1"/>
+                        </a:fillRef>
+                        <a:effectRef idx="1">
+                          <a:schemeClr val="dk1"/>
+                        </a:effectRef>
+                        <a:fontRef idx="minor">
+                          <a:schemeClr val="tx1"/>
+                        </a:fontRef>
+                      </wps:style>
+                      <wps:bodyPr/>
+                    </wps:wsp>
+                  </a:graphicData>
+                </a:graphic>
+                <wp14:sizeRelH relativeFrom="margin">
+                  <wp14:pctWidth>0</wp14:pctWidth>
+                </wp14:sizeRelH>
+                <wp14:sizeRelV relativeFrom="margin">
+                  <wp14:pctHeight>0</wp14:pctHeight>
+                </wp14:sizeRelV>
+              </wp:anchor>
+            </w:drawing>
+          </mc:Choice>
+          <mc:Fallback>
+            <w:pict>
+              <v:line id="Straight Connector 1" o:spid="_x0000_s1026" style="position:absolute;z-index:251659264;visibility:visible;mso-wrap-style:square;mso-width-percent:0;mso-height-percent:0;mso-wrap-distance-left:9pt;mso-wrap-distance-top:0;mso-wrap-distance-right:9pt;mso-wrap-distance-bottom:0;mso-position-horizontal:absolute;mso-position-horizontal-relative:text;mso-position-vertical:absolute;mso-position-vertical-relative:text;mso-width-percent:0;mso-height-percent:0;mso-width-relative:margin;mso-height-relative:margin" from="-9pt,17.75pt" to="521.25pt,17.75pt" o:gfxdata="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" strokecolor="black [3213]" strokeweight=".25pt">
+                <v:shadow on="t" color="black" opacity="24903f" origin=",.5" offset="0,.55556mm"/>
+              </v:line>
+            </w:pict>
+          </mc:Fallback>
+        </mc:AlternateContent>
+      </w:r>
+      <w:proofErr w:type="gramStart"/>
+      <w:r>
+        <w:rPr>
+          <w:b/>
+        </w:rPr>
+        <w:t>Date.</w:t>
+      </w:r>
+      <w:proofErr w:type="gramEnd"/>
+      <w:r>
+        <w:rPr>
+          <w:b/>
+        </w:rPr>
+        <w:t xml:space="preserve"> </w:t>
+      </w:r>
+      <w:proofErr w:type="gramStart"/>
+      <w:r>
+        <w:rPr>
+          <w:b/>
+        </w:rPr>
+        <w:t xml:space="preserve">______________          </w:t>
       </w:r>
       <w:r>
         <w:rPr>
-          <w:rFonts w:ascii="Bookman Old Style" w:hAnsi="Bookman Old Style" w:cs="Bookman Old Style" w:eastAsia="Bookman Old Style"/>
           <w:b/>
-          <w:i w:val="0"/>
-          <w:color w:val="000000"/>
-          <w:sz w:val="24"/>
         </w:rPr>
-        <w:t xml:space="preserve">          Collection No. ...........................</w:t>
+        <w:t xml:space="preserve">                            </w:t>
+      </w:r>
+      <w:r>
+        <w:rPr>
+          <w:b/>
+        </w:rPr>
+        <w:t>Collection No.</w:t>
+      </w:r>
+      <w:proofErr w:type="gramEnd"/>
+      <w:r>
+        <w:rPr>
+          <w:b/>
+        </w:rPr>
+        <w:t xml:space="preserve"> ...........................</w:t>
       </w:r>
     </w:p>
     <w:p>
       <w:pPr>
-        <w:spacing w:before="0" w:after="100" w:lineRule="exact" w:line="300"/>
+        <w:spacing w:after="100" w:line="300" w:lineRule="exact"/>
         <w:jc w:val="both"/>
       </w:pPr>
       <w:r>
-        <w:rPr>
-          <w:rFonts w:ascii="Bookman Old Style" w:hAnsi="Bookman Old Style" w:cs="Bookman Old Style" w:eastAsia="Bookman Old Style"/>
-          <w:b w:val="0"/>
-          <w:i w:val="0"/>
-          <w:color w:val="000000"/>
-          <w:sz w:val="24"/>
-        </w:rPr>
-        <w:t>It is submitted that Smt. Panchali Bagchi, wife of Late Debabrata Bagchi, of Nibedya, Tritirtha Lane, Chakbhabani, Balurghat, has applied on 28.09.2026 for a Legal Heirship Certificate of her husband, who died on 02.04.2017. The certificate is required for transmission of 400 shares of Tata Elxsi Ltd., Folio No. EXD0001178, Certificate No. B247787.</w:t>
+        <w:t>It is submitted that Smt. Panchali Bagchi, wife of Late Debabrata Bagchi, of Nibedya, Tritirtha Lane, Chakbhabani, Balurghat, has applied on 28.09.2026 for a Legal Heirship Certificate in respect of her husband, who died on 02.04.2017. The certificate is required for transmission of 400 shares of Tata Elxsi Ltd., Folio No. EXD0001178, Certificate No. B247787.</w:t>
       </w:r>
     </w:p>
     <w:p>
       <w:pPr>
-        <w:spacing w:before="0" w:after="100" w:lineRule="exact" w:line="300"/>
+        <w:spacing w:after="100" w:line="300" w:lineRule="exact"/>
         <w:jc w:val="both"/>
       </w:pPr>
       <w:r>
-        <w:rPr>
-          <w:rFonts w:ascii="Bookman Old Style" w:hAnsi="Bookman Old Style" w:cs="Bookman Old Style" w:eastAsia="Bookman Old Style"/>
-          <w:b w:val="0"/>
-          <w:i w:val="0"/>
-          <w:color w:val="000000"/>
-          <w:sz w:val="24"/>
-        </w:rPr>
-        <w:t>MUFG Intime India Private Limited, by letter dated 20.07.2026 (Reference No. ID80033739, Outward No. OD80033136), has refused the Legal Heir Certificate earlier issued by Balurghat Municipality. That certificate is not allowed. The certificate now required must be of the Tehsildar, or of an authority above that rank, on the official letterhead, signed with the name of the authority, with the government seal and stamp, valid for transmission of the shares, and in favour of the surviving legal heirs. SEBI Circular No. HO/38/13/11(14)2026-MIRSD-POD/I/17111/2026 dated 23.07.2026, clause 2.1(c) read with clause 4.2.2.3, is to the same effect. The draft certificate placed below is in that form. It is not to be issued until the enquiry report is received. No note to the applicant is to be printed on the certificate.</w:t>
+        <w:t>MUFG Intime India Private Limited, by letter dated 20.07.2026 (Reference No. ID80033739, Outward No. OD80033136), has refused the Legal Heir Certificate earlier issued by Balurghat Municipality. That certificate shall not be acted upon. The certificate now required must be of a revenue authority not below the rank of a Tehsildar, on the official letterhead, signed with the name of the authority, with the government seal and stamp, valid for transmission of the shares, and in favour of the surviving legal heirs. SEBI Circular No. HO/38/13/11(14)2026-MIRSD-POD/I/17111/2026 dated 23.07.2026, clause 2.1(c) read with clause 4.2.2.3, is to the same effect. The draft certificate placed below is in that form. It is not to be issued until the enquiry report is received. No note to the applicant is to be printed on the certificate.</w:t>
       </w:r>
     </w:p>
     <w:p>
       <w:pPr>
-        <w:spacing w:before="0" w:after="100" w:lineRule="exact" w:line="300"/>
+        <w:spacing w:after="100" w:line="300" w:lineRule="exact"/>
         <w:jc w:val="both"/>
       </w:pPr>
       <w:r>
-        <w:rPr>
-          <w:rFonts w:ascii="Bookman Old Style" w:hAnsi="Bookman Old Style" w:cs="Bookman Old Style" w:eastAsia="Bookman Old Style"/>
-          <w:b w:val="0"/>
-          <w:i w:val="0"/>
-          <w:color w:val="000000"/>
-          <w:sz w:val="24"/>
-        </w:rPr>
-        <w:t>The certificate will not by itself complete the transmission. The applicant must separately file with the Registrar a notarised indemnity bond in Annexure-4 of the circular and a notarised affidavit-cum-NOC of all legal heirs in Annexure-5, on non-judicial stamp paper. The Registrar has also asked for a self-attested PAN of the legal heir, and for distinctive numbers 17219031-17219130 to be correctly stated on the affidavit. A copy of the certificate, if submitted, is to be attested by a Notary Public as a true copy, with the complete address of the Notary. Those papers are for the applicant. They are not part of the certificate.</w:t>
+        <w:t>The certificate alone will not complete the transmission. The applicant must separately file with the Registrar a notarised indemnity bond in Annexure-4 of the circular and a notarised affidavit-cum-NOC of all legal heirs in Annexure-5, on non-judicial stamp paper. The Registrar has also asked for a self-attested PAN of the legal heir, and for distinctive numbers 17219031-17219130 to be correctly stated on the affidavit. A copy of the certificate, if submitted, is to be attested by a Notary Public as a true copy, with the complete address of the Notary. Those papers are to be filed by the applicant. They do not form part of the certificate.</w:t>
+      </w:r>
+      <w:proofErr w:type="gramStart"/>
+      <w:proofErr w:type="gramEnd"/>
+    </w:p>
+    <w:p>
+      <w:pPr>
+        <w:spacing w:after="160" w:line="300" w:lineRule="exact"/>
+        <w:jc w:val="both"/>
+      </w:pPr>
+      <w:r>
+        <w:t>The deceased last resided in Balurghat Municipality. The Executive Officer may be requested to cause a field enquiry, to enter the Aadhaar number, the Voter Identity Card number and the PAN of each heir, to sign the report, and to forward it within 15 (fifteen) days. The name in the report must tally with the documents. The municipal certificate shall not be used.</w:t>
       </w:r>
     </w:p>
     <w:p>
       <w:pPr>
-        <w:spacing w:before="0" w:after="160" w:lineRule="exact" w:line="300"/>
-        <w:jc w:val="both"/>
+        <w:spacing w:after="0" w:line="320" w:lineRule="exact"/>
+        <w:rPr>
+          <w:b/>
+        </w:rPr>
       </w:pPr>
-      <w:r>
-        <w:rPr>
-          <w:rFonts w:ascii="Bookman Old Style" w:hAnsi="Bookman Old Style" w:cs="Bookman Old Style" w:eastAsia="Bookman Old Style"/>
-          <w:b w:val="0"/>
-          <w:i w:val="0"/>
-          <w:color w:val="000000"/>
-          <w:sz w:val="24"/>
-        </w:rPr>
-        <w:t>The deceased last resided in Balurghat Municipality. The Executive Officer may be requested to cause a field enquiry, to fill Aadhaar number, Voter Identity Card number and PAN of each heir, to sign the report, and to forward it within 15 (fifteen) days. The name in the report must tally with the documents. The municipal certificate shall not be used.</w:t>
-      </w:r>
     </w:p>
     <w:p>
       <w:pPr>
-        <w:spacing w:before="0" w:after="0" w:lineRule="exact" w:line="320"/>
-        <w:jc w:val="left"/>
+        <w:spacing w:after="0" w:line="320" w:lineRule="exact"/>
       </w:pPr>
+      <w:bookmarkStart w:id="0" w:name="_GoBack"/>
+      <w:bookmarkEnd w:id="0"/>
+      <w:proofErr w:type="gramStart"/>
       <w:r>
         <w:rPr>
-          <w:rFonts w:ascii="Bookman Old Style" w:hAnsi="Bookman Old Style" w:cs="Bookman Old Style" w:eastAsia="Bookman Old Style"/>
           <w:b/>
-          <w:i w:val="0"/>
-          <w:color w:val="000000"/>
-          <w:sz w:val="24"/>
         </w:rPr>
         <w:t>Submitted for kind perusal and approval.</w:t>
       </w:r>
+      <w:proofErr w:type="gramEnd"/>
     </w:p>
     <w:sectPr>
       <w:pgSz w:w="12240" w:h="15840"/>
@@ -183,7 +340,7 @@
 </file>
 
 <file path=word/numbering.xml><?xml version="1.0" encoding="utf-8"?>
-<w:numbering xmlns:wpc="http://schemas.microsoft.com/office/word/2010/wordprocessingCanvas" xmlns:mo="http://schemas.microsoft.com/office/mac/office/2008/main" xmlns:mc="http://schemas.openxmlformats.org/markup-compatibility/2006" xmlns:mv="urn:schemas-microsoft-com:mac:vml" xmlns:o="urn:schemas-microsoft-com:office:office" xmlns:r="http://schemas.openxmlformats.org/officeDocument/2006/relationships" xmlns:m="http://schemas.openxmlformats.org/officeDocument/2006/math" xmlns:v="urn:schemas-microsoft-com:vml" xmlns:wp14="http://schemas.microsoft.com/office/word/2010/wordprocessingDrawing" xmlns:wp="http://schemas.openxmlformats.org/drawingml/2006/wordprocessingDrawing" xmlns:w10="urn:schemas-microsoft-com:office:word" xmlns:w="http://schemas.openxmlformats.org/wordprocessingml/2006/main" xmlns:w14="http://schemas.microsoft.com/office/word/2010/wordml" xmlns:wpg="http://schemas.microsoft.com/office/word/2010/wordprocessingGroup" xmlns:wpi="http://schemas.microsoft.com/office/word/2010/wordprocessingInk" xmlns:wne="http://schemas.microsoft.com/office/word/2006/wordml" xmlns:wps="http://schemas.microsoft.com/office/word/2010/wordprocessingShape" mc:Ignorable="w14 wp14">
+<w:numbering xmlns:wpc="http://schemas.microsoft.com/office/word/2010/wordprocessingCanvas" xmlns:mc="http://schemas.openxmlformats.org/markup-compatibility/2006" xmlns:o="urn:schemas-microsoft-com:office:office" xmlns:r="http://schemas.openxmlformats.org/officeDocument/2006/relationships" xmlns:m="http://schemas.openxmlformats.org/officeDocument/2006/math" xmlns:v="urn:schemas-microsoft-com:vml" xmlns:wp14="http://schemas.microsoft.com/office/word/2010/wordprocessingDrawing" xmlns:wp="http://schemas.openxmlformats.org/drawingml/2006/wordprocessingDrawing" xmlns:w10="urn:schemas-microsoft-com:office:word" xmlns:w="http://schemas.openxmlformats.org/wordprocessingml/2006/main" xmlns:w14="http://schemas.microsoft.com/office/word/2010/wordml" xmlns:wpg="http://schemas.microsoft.com/office/word/2010/wordprocessingGroup" xmlns:wpi="http://schemas.microsoft.com/office/word/2010/wordprocessingInk" xmlns:wne="http://schemas.microsoft.com/office/word/2006/wordml" xmlns:wps="http://schemas.microsoft.com/office/word/2010/wordprocessingShape" mc:Ignorable="w14 wp14">
   <w:abstractNum w:abstractNumId="0">
     <w:nsid w:val="FFFFFF7C"/>
     <w:multiLevelType w:val="singleLevel"/>
@@ -402,7 +559,7 @@
       </w:pPr>
     </w:pPrDefault>
   </w:docDefaults>
-  <w:latentStyles w:defLockedState="0" w:defUIPriority="99" w:defSemiHidden="1" w:defUnhideWhenUsed="1" w:defQFormat="0" w:count="276">
+  <w:latentStyles w:defLockedState="0" w:defUIPriority="99" w:defSemiHidden="1" w:defUnhideWhenUsed="1" w:defQFormat="0" w:count="267">
     <w:lsdException w:name="Normal" w:semiHidden="0" w:uiPriority="0" w:unhideWhenUsed="0" w:qFormat="1"/>
     <w:lsdException w:name="heading 1" w:semiHidden="0" w:uiPriority="9" w:unhideWhenUsed="0" w:qFormat="1"/>
     <w:lsdException w:name="heading 2" w:uiPriority="9" w:qFormat="1"/>
@@ -546,54 +703,10 @@
     <w:qFormat/>
     <w:rsid w:val="00FC693F"/>
     <w:rPr>
-      <w:rFonts w:ascii="Bookman Old Style" w:hAnsi="Bookman Old Style" w:cs="Bookman Old Style" w:eastAsia="Bookman Old Style"/>
+      <w:rFonts w:ascii="Bookman Old Style" w:eastAsia="Bookman Old Style" w:hAnsi="Bookman Old Style" w:cs="Bookman Old Style"/>
       <w:color w:val="000000"/>
       <w:sz w:val="24"/>
     </w:rPr>
-  </w:style>
-  <w:style w:type="paragraph" w:styleId="Header">
-    <w:name w:val="header"/>
-    <w:basedOn w:val="Normal"/>
-    <w:link w:val="HeaderChar"/>
-    <w:uiPriority w:val="99"/>
-    <w:unhideWhenUsed/>
-    <w:rsid w:val="00E618BF"/>
-    <w:pPr>
-      <w:tabs>
-        <w:tab w:val="center" w:pos="4680"/>
-        <w:tab w:val="right" w:pos="9360"/>
-      </w:tabs>
-      <w:spacing w:after="0" w:line="240" w:lineRule="auto"/>
-    </w:pPr>
-  </w:style>
-  <w:style w:type="character" w:customStyle="1" w:styleId="HeaderChar">
-    <w:name w:val="Header Char"/>
-    <w:basedOn w:val="DefaultParagraphFont"/>
-    <w:link w:val="Header"/>
-    <w:uiPriority w:val="99"/>
-    <w:rsid w:val="00E618BF"/>
-  </w:style>
-  <w:style w:type="paragraph" w:styleId="Footer">
-    <w:name w:val="footer"/>
-    <w:basedOn w:val="Normal"/>
-    <w:link w:val="FooterChar"/>
-    <w:uiPriority w:val="99"/>
-    <w:unhideWhenUsed/>
-    <w:rsid w:val="00E618BF"/>
-    <w:pPr>
-      <w:tabs>
-        <w:tab w:val="center" w:pos="4680"/>
-        <w:tab w:val="right" w:pos="9360"/>
-      </w:tabs>
-      <w:spacing w:after="0" w:line="240" w:lineRule="auto"/>
-    </w:pPr>
-  </w:style>
-  <w:style w:type="character" w:customStyle="1" w:styleId="FooterChar">
-    <w:name w:val="Footer Char"/>
-    <w:basedOn w:val="DefaultParagraphFont"/>
-    <w:link w:val="Footer"/>
-    <w:uiPriority w:val="99"/>
-    <w:rsid w:val="00E618BF"/>
   </w:style>
   <w:style w:type="paragraph" w:styleId="Heading1">
     <w:name w:val="heading 1"/>
@@ -831,6 +944,50 @@
     <w:semiHidden/>
     <w:unhideWhenUsed/>
   </w:style>
+  <w:style w:type="paragraph" w:styleId="Header">
+    <w:name w:val="header"/>
+    <w:basedOn w:val="Normal"/>
+    <w:link w:val="HeaderChar"/>
+    <w:uiPriority w:val="99"/>
+    <w:unhideWhenUsed/>
+    <w:rsid w:val="00E618BF"/>
+    <w:pPr>
+      <w:tabs>
+        <w:tab w:val="center" w:pos="4680"/>
+        <w:tab w:val="right" w:pos="9360"/>
+      </w:tabs>
+      <w:spacing w:after="0" w:line="240" w:lineRule="auto"/>
+    </w:pPr>
+  </w:style>
+  <w:style w:type="character" w:customStyle="1" w:styleId="HeaderChar">
+    <w:name w:val="Header Char"/>
+    <w:basedOn w:val="DefaultParagraphFont"/>
+    <w:link w:val="Header"/>
+    <w:uiPriority w:val="99"/>
+    <w:rsid w:val="00E618BF"/>
+  </w:style>
+  <w:style w:type="paragraph" w:styleId="Footer">
+    <w:name w:val="footer"/>
+    <w:basedOn w:val="Normal"/>
+    <w:link w:val="FooterChar"/>
+    <w:uiPriority w:val="99"/>
+    <w:unhideWhenUsed/>
+    <w:rsid w:val="00E618BF"/>
+    <w:pPr>
+      <w:tabs>
+        <w:tab w:val="center" w:pos="4680"/>
+        <w:tab w:val="right" w:pos="9360"/>
+      </w:tabs>
+      <w:spacing w:after="0" w:line="240" w:lineRule="auto"/>
+    </w:pPr>
+  </w:style>
+  <w:style w:type="character" w:customStyle="1" w:styleId="FooterChar">
+    <w:name w:val="Footer Char"/>
+    <w:basedOn w:val="DefaultParagraphFont"/>
+    <w:link w:val="Footer"/>
+    <w:uiPriority w:val="99"/>
+    <w:rsid w:val="00E618BF"/>
+  </w:style>
   <w:style w:type="paragraph" w:styleId="NoSpacing">
     <w:name w:val="No Spacing"/>
     <w:uiPriority w:val="1"/>
@@ -941,7 +1098,6 @@
       <w:iCs/>
       <w:color w:val="4F81BD" w:themeColor="accent1"/>
       <w:spacing w:val="15"/>
-      <w:sz w:val="24"/>
       <w:szCs w:val="24"/>
     </w:rPr>
   </w:style>
@@ -12237,7 +12393,7 @@
 </file>
 
 <file path=word/stylesWithEffects.xml><?xml version="1.0" encoding="utf-8"?>
-<w:styles xmlns:wpc="http://schemas.microsoft.com/office/word/2010/wordprocessingCanvas" xmlns:mo="http://schemas.microsoft.com/office/mac/office/2008/main" xmlns:mc="http://schemas.openxmlformats.org/markup-compatibility/2006" xmlns:mv="urn:schemas-microsoft-com:mac:vml" xmlns:o="urn:schemas-microsoft-com:office:office" xmlns:r="http://schemas.openxmlformats.org/officeDocument/2006/relationships" xmlns:m="http://schemas.openxmlformats.org/officeDocument/2006/math" xmlns:v="urn:schemas-microsoft-com:vml" xmlns:wp14="http://schemas.microsoft.com/office/word/2010/wordprocessingDrawing" xmlns:wp="http://schemas.openxmlformats.org/drawingml/2006/wordprocessingDrawing" xmlns:w10="urn:schemas-microsoft-com:office:word" xmlns:w="http://schemas.openxmlformats.org/wordprocessingml/2006/main" xmlns:w14="http://schemas.microsoft.com/office/word/2010/wordml" xmlns:wpg="http://schemas.microsoft.com/office/word/2010/wordprocessingGroup" xmlns:wpi="http://schemas.microsoft.com/office/word/2010/wordprocessingInk" xmlns:wne="http://schemas.microsoft.com/office/word/2006/wordml" xmlns:wps="http://schemas.microsoft.com/office/word/2010/wordprocessingShape" mc:Ignorable="w14 wp14">
+<w:styles xmlns:wpc="http://schemas.microsoft.com/office/word/2010/wordprocessingCanvas" xmlns:mc="http://schemas.openxmlformats.org/markup-compatibility/2006" xmlns:o="urn:schemas-microsoft-com:office:office" xmlns:r="http://schemas.openxmlformats.org/officeDocument/2006/relationships" xmlns:m="http://schemas.openxmlformats.org/officeDocument/2006/math" xmlns:v="urn:schemas-microsoft-com:vml" xmlns:wp14="http://schemas.microsoft.com/office/word/2010/wordprocessingDrawing" xmlns:wp="http://schemas.openxmlformats.org/drawingml/2006/wordprocessingDrawing" xmlns:w10="urn:schemas-microsoft-com:office:word" xmlns:w="http://schemas.openxmlformats.org/wordprocessingml/2006/main" xmlns:w14="http://schemas.microsoft.com/office/word/2010/wordml" xmlns:wpg="http://schemas.microsoft.com/office/word/2010/wordprocessingGroup" xmlns:wpi="http://schemas.microsoft.com/office/word/2010/wordprocessingInk" xmlns:wne="http://schemas.microsoft.com/office/word/2006/wordml" xmlns:wps="http://schemas.microsoft.com/office/word/2010/wordprocessingShape" mc:Ignorable="w14 wp14">
   <w:docDefaults>
     <w:rPrDefault>
       <w:rPr>
@@ -12253,7 +12409,7 @@
       </w:pPr>
     </w:pPrDefault>
   </w:docDefaults>
-  <w:latentStyles w:defLockedState="0" w:defUIPriority="99" w:defSemiHidden="1" w:defUnhideWhenUsed="1" w:defQFormat="0" w:count="276">
+  <w:latentStyles w:defLockedState="0" w:defUIPriority="99" w:defSemiHidden="1" w:defUnhideWhenUsed="1" w:defQFormat="0" w:count="267">
     <w:lsdException w:name="Normal" w:semiHidden="0" w:uiPriority="0" w:unhideWhenUsed="0" w:qFormat="1"/>
     <w:lsdException w:name="heading 1" w:semiHidden="0" w:uiPriority="9" w:unhideWhenUsed="0" w:qFormat="1"/>
     <w:lsdException w:name="heading 2" w:uiPriority="9" w:qFormat="1"/>
@@ -12396,6 +12552,11 @@
     <w:name w:val="Normal"/>
     <w:qFormat/>
     <w:rsid w:val="00FC693F"/>
+    <w:rPr>
+      <w:rFonts w:ascii="Bookman Old Style" w:eastAsia="Bookman Old Style" w:hAnsi="Bookman Old Style" w:cs="Bookman Old Style"/>
+      <w:color w:val="000000"/>
+      <w:sz w:val="24"/>
+    </w:rPr>
   </w:style>
   <w:style w:type="paragraph" w:styleId="Heading1">
     <w:name w:val="heading 1"/>
@@ -12633,6 +12794,50 @@
     <w:semiHidden/>
     <w:unhideWhenUsed/>
   </w:style>
+  <w:style w:type="paragraph" w:styleId="Header">
+    <w:name w:val="header"/>
+    <w:basedOn w:val="Normal"/>
+    <w:link w:val="HeaderChar"/>
+    <w:uiPriority w:val="99"/>
+    <w:unhideWhenUsed/>
+    <w:rsid w:val="00E618BF"/>
+    <w:pPr>
+      <w:tabs>
+        <w:tab w:val="center" w:pos="4680"/>
+        <w:tab w:val="right" w:pos="9360"/>
+      </w:tabs>
+      <w:spacing w:after="0" w:line="240" w:lineRule="auto"/>
+    </w:pPr>
+  </w:style>
+  <w:style w:type="character" w:customStyle="1" w:styleId="HeaderChar">
+    <w:name w:val="Header Char"/>
+    <w:basedOn w:val="DefaultParagraphFont"/>
+    <w:link w:val="Header"/>
+    <w:uiPriority w:val="99"/>
+    <w:rsid w:val="00E618BF"/>
+  </w:style>
+  <w:style w:type="paragraph" w:styleId="Footer">
+    <w:name w:val="footer"/>
+    <w:basedOn w:val="Normal"/>
+    <w:link w:val="FooterChar"/>
+    <w:uiPriority w:val="99"/>
+    <w:unhideWhenUsed/>
+    <w:rsid w:val="00E618BF"/>
+    <w:pPr>
+      <w:tabs>
+        <w:tab w:val="center" w:pos="4680"/>
+        <w:tab w:val="right" w:pos="9360"/>
+      </w:tabs>
+      <w:spacing w:after="0" w:line="240" w:lineRule="auto"/>
+    </w:pPr>
+  </w:style>
+  <w:style w:type="character" w:customStyle="1" w:styleId="FooterChar">
+    <w:name w:val="Footer Char"/>
+    <w:basedOn w:val="DefaultParagraphFont"/>
+    <w:link w:val="Footer"/>
+    <w:uiPriority w:val="99"/>
+    <w:rsid w:val="00E618BF"/>
+  </w:style>
   <w:style w:type="paragraph" w:styleId="NoSpacing">
     <w:name w:val="No Spacing"/>
     <w:uiPriority w:val="1"/>
@@ -12743,7 +12948,6 @@
       <w:iCs/>
       <w:color w:val="4F81BD" w:themeColor="accent1"/>
       <w:spacing w:val="15"/>
-      <w:sz w:val="24"/>
       <w:szCs w:val="24"/>
     </w:rPr>
   </w:style>
@@ -24363,7 +24567,7 @@
 </file>
 
 <file path=customXml/itemProps1.xml><?xml version="1.0" encoding="utf-8"?>
-<ds:datastoreItem xmlns:ds="http://schemas.openxmlformats.org/officeDocument/2006/customXml" ds:itemID="{EF278816-EC6F-A645-907D-7F25AECB1D4A}">
+<ds:datastoreItem xmlns:ds="http://schemas.openxmlformats.org/officeDocument/2006/customXml" ds:itemID="{8BAFF9E7-D8FA-4956-BD94-C3B6CFC225DA}">
   <ds:schemaRefs>
     <ds:schemaRef ds:uri="http://schemas.openxmlformats.org/officeDocument/2006/bibliography"/>
   </ds:schemaRefs>

</xml_diff>